<commit_message>
Clarify unit assessment gradebook mapping
</commit_message>
<xml_diff>
--- a/STARLAB_Unit_1/Teaching Guides/00_Unit_1_Overview_and_Preparation.docx
+++ b/STARLAB_Unit_1/Teaching Guides/00_Unit_1_Overview_and_Preparation.docx
@@ -812,35 +812,29 @@
           <w:szCs w:val="46"/>
         </w:rPr>
       </w:pPr>
-      <w:bookmarkStart w:colFirst="0" w:colLast="0" w:name="_4lrq0iugzznw" w:id="8"/>
-      <w:bookmarkEnd w:id="8"/>
       <w:r>
-        <w:rPr>
-          <w:b w:val="1"/>
-          <w:bCs w:val="1"/>
-          <w:sz w:val="46"/>
-          <w:szCs w:val="46"/>
-          <w:rtl w:val="0"/>
-        </w:rPr>
-        <w:t xml:space="preserve">Suggested Assessment Categories</w:t>
+        <w:t>Optional Within-Unit Scoring Breakdown</w:t>
       </w:r>
     </w:p>
     <w:p>
+      <w:pPr/>
+      <w:r>
+        <w:t>These percentages describe the suggested balance of evidence within this unit. They do not replace the six official STARLAB gradebook categories or course weights. Record each scored assignment in the official category identified below. Teachers may leave formative items ungraded or adjust local point values while preserving the official course weights.</w:t>
+      </w:r>
+    </w:p>
+    <w:p>
       <w:pPr>
         <w:spacing w:after="240" w:before="240" w:lineRule="auto"/>
         <w:rPr/>
       </w:pPr>
       <w:r>
-        <w:rPr>
-          <w:rtl w:val="0"/>
-        </w:rPr>
-        <w:t>These percentages are optional local within-unit scoring suggestions, not course gradebook weights. Record question, design, ethics, and pitch evidence primarily under Project Proposal; identity and reflection evidence may be recorded under Research Journal/Documentation. The six syllabus weights remain authoritative.</w:t>
+        <w:t>Unit mapping: If scored, these foundation tasks provide evidence for Project Proposal. Science identity and research-interest inventories may remain formative.</w:t>
       </w:r>
     </w:p>
     <w:tbl>
       <w:tblPr>
         <w:tblStyle w:val="Table1"/>
-        <w:tblW w:w="5275.0" w:type="dxa"/>
+        <w:tblW w:w="9360" w:type="dxa"/>
         <w:jc w:val="left"/>
         <w:tblBorders>
           <w:top w:color="000000" w:space="0" w:sz="0" w:val="nil"/>
@@ -854,20 +848,16 @@
         <w:tblLook w:val="0600"/>
       </w:tblPr>
       <w:tblGrid>
-        <w:gridCol w:w="3230"/>
-        <w:gridCol w:w="2045"/>
-        <w:tblGridChange w:id="0">
-          <w:tblGrid>
-            <w:gridCol w:w="3230"/>
-            <w:gridCol w:w="2045"/>
-          </w:tblGrid>
-        </w:tblGridChange>
+        <w:gridCol w:w="3931"/>
+        <w:gridCol w:w="2059"/>
+        <w:gridCol w:w="3370"/>
       </w:tblGrid>
       <w:tr>
         <w:trPr>
           <w:cantSplit w:val="0"/>
           <w:trHeight w:val="515" w:hRule="atLeast"/>
           <w:tblHeader w:val="0"/>
+          <w:tblHeader w:val="true"/>
         </w:trPr>
         <w:tc>
           <w:tcPr>
@@ -883,7 +873,8 @@
               <w:bottom w:w="100.0" w:type="dxa"/>
               <w:right w:w="100.0" w:type="dxa"/>
             </w:tcMar>
-            <w:vAlign w:val="top"/>
+            <w:vAlign w:val="center"/>
+            <w:tcW w:type="dxa" w:w="3931"/>
           </w:tcPr>
           <w:p>
             <w:pPr>
@@ -919,25 +910,49 @@
               <w:bottom w:w="100.0" w:type="dxa"/>
               <w:right w:w="100.0" w:type="dxa"/>
             </w:tcMar>
-            <w:vAlign w:val="top"/>
+            <w:vAlign w:val="center"/>
+            <w:tcW w:type="dxa" w:w="2059"/>
           </w:tcPr>
           <w:p>
             <w:pPr>
               <w:jc w:val="center"/>
               <w:rPr/>
             </w:pPr>
+            <w:r/>
             <w:r>
               <w:rPr>
                 <w:b w:val="1"/>
                 <w:bCs w:val="1"/>
                 <w:rtl w:val="0"/>
               </w:rPr>
-              <w:t xml:space="preserve">Suggested Weight</w:t>
+              <w:t>Suggested Within-Unit Weight</w:t>
             </w:r>
+          </w:p>
+        </w:tc>
+        <w:tc>
+          <w:tcPr>
+            <w:tcW w:type="dxa" w:w="3370"/>
+            <w:tcMar>
+              <w:top w:w="100.0" w:type="dxa"/>
+              <w:left w:w="100.0" w:type="dxa"/>
+              <w:bottom w:w="100.0" w:type="dxa"/>
+              <w:right w:w="100.0" w:type="dxa"/>
+            </w:tcMar>
+            <w:vAlign w:val="center"/>
+          </w:tcPr>
+          <w:p>
+            <w:pPr>
+              <w:jc w:val="center"/>
+              <w:rPr/>
+            </w:pPr>
+            <w:r/>
             <w:r>
               <w:rPr>
+                <w:b w:val="1"/>
+                <w:bCs w:val="1"/>
                 <w:rtl w:val="0"/>
               </w:rPr>
+              <w:t>Official Gradebook Category</w:t>
             </w:r>
           </w:p>
         </w:tc>
@@ -962,7 +977,8 @@
               <w:bottom w:w="100.0" w:type="dxa"/>
               <w:right w:w="100.0" w:type="dxa"/>
             </w:tcMar>
-            <w:vAlign w:val="top"/>
+            <w:vAlign w:val="center"/>
+            <w:tcW w:type="dxa" w:w="3931"/>
           </w:tcPr>
           <w:p>
             <w:pPr>
@@ -990,7 +1006,8 @@
               <w:bottom w:w="100.0" w:type="dxa"/>
               <w:right w:w="100.0" w:type="dxa"/>
             </w:tcMar>
-            <w:vAlign w:val="top"/>
+            <w:vAlign w:val="center"/>
+            <w:tcW w:type="dxa" w:w="2059"/>
           </w:tcPr>
           <w:p>
             <w:pPr>
@@ -1001,6 +1018,30 @@
                 <w:rtl w:val="0"/>
               </w:rPr>
               <w:t xml:space="preserve">10%</w:t>
+            </w:r>
+          </w:p>
+        </w:tc>
+        <w:tc>
+          <w:tcPr>
+            <w:tcW w:type="dxa" w:w="3370"/>
+            <w:tcMar>
+              <w:top w:w="100.0" w:type="dxa"/>
+              <w:left w:w="100.0" w:type="dxa"/>
+              <w:bottom w:w="100.0" w:type="dxa"/>
+              <w:right w:w="100.0" w:type="dxa"/>
+            </w:tcMar>
+            <w:vAlign w:val="center"/>
+          </w:tcPr>
+          <w:p>
+            <w:pPr>
+              <w:rPr/>
+            </w:pPr>
+            <w:r/>
+            <w:r>
+              <w:rPr>
+                <w:rtl w:val="0"/>
+              </w:rPr>
+              <w:t>Project Proposal</w:t>
             </w:r>
           </w:p>
         </w:tc>
@@ -1025,7 +1066,8 @@
               <w:bottom w:w="100.0" w:type="dxa"/>
               <w:right w:w="100.0" w:type="dxa"/>
             </w:tcMar>
-            <w:vAlign w:val="top"/>
+            <w:vAlign w:val="center"/>
+            <w:tcW w:type="dxa" w:w="3931"/>
           </w:tcPr>
           <w:p>
             <w:pPr>
@@ -1053,7 +1095,8 @@
               <w:bottom w:w="100.0" w:type="dxa"/>
               <w:right w:w="100.0" w:type="dxa"/>
             </w:tcMar>
-            <w:vAlign w:val="top"/>
+            <w:vAlign w:val="center"/>
+            <w:tcW w:type="dxa" w:w="2059"/>
           </w:tcPr>
           <w:p>
             <w:pPr>
@@ -1064,6 +1107,30 @@
                 <w:rtl w:val="0"/>
               </w:rPr>
               <w:t xml:space="preserve">10%</w:t>
+            </w:r>
+          </w:p>
+        </w:tc>
+        <w:tc>
+          <w:tcPr>
+            <w:tcW w:type="dxa" w:w="3370"/>
+            <w:tcMar>
+              <w:top w:w="100.0" w:type="dxa"/>
+              <w:left w:w="100.0" w:type="dxa"/>
+              <w:bottom w:w="100.0" w:type="dxa"/>
+              <w:right w:w="100.0" w:type="dxa"/>
+            </w:tcMar>
+            <w:vAlign w:val="center"/>
+          </w:tcPr>
+          <w:p>
+            <w:pPr>
+              <w:rPr/>
+            </w:pPr>
+            <w:r/>
+            <w:r>
+              <w:rPr>
+                <w:rtl w:val="0"/>
+              </w:rPr>
+              <w:t>Project Proposal</w:t>
             </w:r>
           </w:p>
         </w:tc>
@@ -1088,7 +1155,8 @@
               <w:bottom w:w="100.0" w:type="dxa"/>
               <w:right w:w="100.0" w:type="dxa"/>
             </w:tcMar>
-            <w:vAlign w:val="top"/>
+            <w:vAlign w:val="center"/>
+            <w:tcW w:type="dxa" w:w="3931"/>
           </w:tcPr>
           <w:p>
             <w:pPr>
@@ -1116,7 +1184,8 @@
               <w:bottom w:w="100.0" w:type="dxa"/>
               <w:right w:w="100.0" w:type="dxa"/>
             </w:tcMar>
-            <w:vAlign w:val="top"/>
+            <w:vAlign w:val="center"/>
+            <w:tcW w:type="dxa" w:w="2059"/>
           </w:tcPr>
           <w:p>
             <w:pPr>
@@ -1127,6 +1196,30 @@
                 <w:rtl w:val="0"/>
               </w:rPr>
               <w:t xml:space="preserve">10%</w:t>
+            </w:r>
+          </w:p>
+        </w:tc>
+        <w:tc>
+          <w:tcPr>
+            <w:tcW w:type="dxa" w:w="3370"/>
+            <w:tcMar>
+              <w:top w:w="100.0" w:type="dxa"/>
+              <w:left w:w="100.0" w:type="dxa"/>
+              <w:bottom w:w="100.0" w:type="dxa"/>
+              <w:right w:w="100.0" w:type="dxa"/>
+            </w:tcMar>
+            <w:vAlign w:val="center"/>
+          </w:tcPr>
+          <w:p>
+            <w:pPr>
+              <w:rPr/>
+            </w:pPr>
+            <w:r/>
+            <w:r>
+              <w:rPr>
+                <w:rtl w:val="0"/>
+              </w:rPr>
+              <w:t>Project Proposal</w:t>
             </w:r>
           </w:p>
         </w:tc>
@@ -1151,7 +1244,8 @@
               <w:bottom w:w="100.0" w:type="dxa"/>
               <w:right w:w="100.0" w:type="dxa"/>
             </w:tcMar>
-            <w:vAlign w:val="top"/>
+            <w:vAlign w:val="center"/>
+            <w:tcW w:type="dxa" w:w="3931"/>
           </w:tcPr>
           <w:p>
             <w:pPr>
@@ -1179,7 +1273,8 @@
               <w:bottom w:w="100.0" w:type="dxa"/>
               <w:right w:w="100.0" w:type="dxa"/>
             </w:tcMar>
-            <w:vAlign w:val="top"/>
+            <w:vAlign w:val="center"/>
+            <w:tcW w:type="dxa" w:w="2059"/>
           </w:tcPr>
           <w:p>
             <w:pPr>
@@ -1190,6 +1285,30 @@
                 <w:rtl w:val="0"/>
               </w:rPr>
               <w:t xml:space="preserve">20%</w:t>
+            </w:r>
+          </w:p>
+        </w:tc>
+        <w:tc>
+          <w:tcPr>
+            <w:tcW w:type="dxa" w:w="3370"/>
+            <w:tcMar>
+              <w:top w:w="100.0" w:type="dxa"/>
+              <w:left w:w="100.0" w:type="dxa"/>
+              <w:bottom w:w="100.0" w:type="dxa"/>
+              <w:right w:w="100.0" w:type="dxa"/>
+            </w:tcMar>
+            <w:vAlign w:val="center"/>
+          </w:tcPr>
+          <w:p>
+            <w:pPr>
+              <w:rPr/>
+            </w:pPr>
+            <w:r/>
+            <w:r>
+              <w:rPr>
+                <w:rtl w:val="0"/>
+              </w:rPr>
+              <w:t>Project Proposal</w:t>
             </w:r>
           </w:p>
         </w:tc>
@@ -1214,7 +1333,8 @@
               <w:bottom w:w="100.0" w:type="dxa"/>
               <w:right w:w="100.0" w:type="dxa"/>
             </w:tcMar>
-            <w:vAlign w:val="top"/>
+            <w:vAlign w:val="center"/>
+            <w:tcW w:type="dxa" w:w="3931"/>
           </w:tcPr>
           <w:p>
             <w:pPr>
@@ -1242,7 +1362,8 @@
               <w:bottom w:w="100.0" w:type="dxa"/>
               <w:right w:w="100.0" w:type="dxa"/>
             </w:tcMar>
-            <w:vAlign w:val="top"/>
+            <w:vAlign w:val="center"/>
+            <w:tcW w:type="dxa" w:w="2059"/>
           </w:tcPr>
           <w:p>
             <w:pPr>
@@ -1253,6 +1374,30 @@
                 <w:rtl w:val="0"/>
               </w:rPr>
               <w:t xml:space="preserve">15%</w:t>
+            </w:r>
+          </w:p>
+        </w:tc>
+        <w:tc>
+          <w:tcPr>
+            <w:tcW w:type="dxa" w:w="3370"/>
+            <w:tcMar>
+              <w:top w:w="100.0" w:type="dxa"/>
+              <w:left w:w="100.0" w:type="dxa"/>
+              <w:bottom w:w="100.0" w:type="dxa"/>
+              <w:right w:w="100.0" w:type="dxa"/>
+            </w:tcMar>
+            <w:vAlign w:val="center"/>
+          </w:tcPr>
+          <w:p>
+            <w:pPr>
+              <w:rPr/>
+            </w:pPr>
+            <w:r/>
+            <w:r>
+              <w:rPr>
+                <w:rtl w:val="0"/>
+              </w:rPr>
+              <w:t>Project Proposal</w:t>
             </w:r>
           </w:p>
         </w:tc>
@@ -1277,7 +1422,8 @@
               <w:bottom w:w="100.0" w:type="dxa"/>
               <w:right w:w="100.0" w:type="dxa"/>
             </w:tcMar>
-            <w:vAlign w:val="top"/>
+            <w:vAlign w:val="center"/>
+            <w:tcW w:type="dxa" w:w="3931"/>
           </w:tcPr>
           <w:p>
             <w:pPr>
@@ -1305,7 +1451,8 @@
               <w:bottom w:w="100.0" w:type="dxa"/>
               <w:right w:w="100.0" w:type="dxa"/>
             </w:tcMar>
-            <w:vAlign w:val="top"/>
+            <w:vAlign w:val="center"/>
+            <w:tcW w:type="dxa" w:w="2059"/>
           </w:tcPr>
           <w:p>
             <w:pPr>
@@ -1316,6 +1463,30 @@
                 <w:rtl w:val="0"/>
               </w:rPr>
               <w:t xml:space="preserve">20%</w:t>
+            </w:r>
+          </w:p>
+        </w:tc>
+        <w:tc>
+          <w:tcPr>
+            <w:tcW w:type="dxa" w:w="3370"/>
+            <w:tcMar>
+              <w:top w:w="100.0" w:type="dxa"/>
+              <w:left w:w="100.0" w:type="dxa"/>
+              <w:bottom w:w="100.0" w:type="dxa"/>
+              <w:right w:w="100.0" w:type="dxa"/>
+            </w:tcMar>
+            <w:vAlign w:val="center"/>
+          </w:tcPr>
+          <w:p>
+            <w:pPr>
+              <w:rPr/>
+            </w:pPr>
+            <w:r/>
+            <w:r>
+              <w:rPr>
+                <w:rtl w:val="0"/>
+              </w:rPr>
+              <w:t>Project Proposal</w:t>
             </w:r>
           </w:p>
         </w:tc>
@@ -1340,7 +1511,8 @@
               <w:bottom w:w="100.0" w:type="dxa"/>
               <w:right w:w="100.0" w:type="dxa"/>
             </w:tcMar>
-            <w:vAlign w:val="top"/>
+            <w:vAlign w:val="center"/>
+            <w:tcW w:type="dxa" w:w="3931"/>
           </w:tcPr>
           <w:p>
             <w:pPr>
@@ -1368,7 +1540,8 @@
               <w:bottom w:w="100.0" w:type="dxa"/>
               <w:right w:w="100.0" w:type="dxa"/>
             </w:tcMar>
-            <w:vAlign w:val="top"/>
+            <w:vAlign w:val="center"/>
+            <w:tcW w:type="dxa" w:w="2059"/>
           </w:tcPr>
           <w:p>
             <w:pPr>
@@ -1379,6 +1552,30 @@
                 <w:rtl w:val="0"/>
               </w:rPr>
               <w:t xml:space="preserve">15%</w:t>
+            </w:r>
+          </w:p>
+        </w:tc>
+        <w:tc>
+          <w:tcPr>
+            <w:tcW w:type="dxa" w:w="3370"/>
+            <w:tcMar>
+              <w:top w:w="100.0" w:type="dxa"/>
+              <w:left w:w="100.0" w:type="dxa"/>
+              <w:bottom w:w="100.0" w:type="dxa"/>
+              <w:right w:w="100.0" w:type="dxa"/>
+            </w:tcMar>
+            <w:vAlign w:val="center"/>
+          </w:tcPr>
+          <w:p>
+            <w:pPr>
+              <w:rPr/>
+            </w:pPr>
+            <w:r/>
+            <w:r>
+              <w:rPr>
+                <w:rtl w:val="0"/>
+              </w:rPr>
+              <w:t>Project Proposal</w:t>
             </w:r>
           </w:p>
         </w:tc>

</xml_diff>